<commit_message>
Update final submission files and manifest
- Updated the final report document with new content.
- Modified the manifest.yaml to reflect changes in file counts, verification status, and timestamps.
- Added a new handout PDF to the presentation materials.
- Updated the presentation slides with new content.
- Revised the slide-cards-12.md to clarify the scheduler transition explanation.
</commit_message>
<xml_diff>
--- a/08-final-submission/final-report/final-report.docx
+++ b/08-final-submission/final-report/final-report.docx
@@ -518,7 +518,7 @@
           <w:sz w:val="20"/>
           <w:szCs w:val="20"/>
         </w:rPr>
-        <w:t xml:space="preserve">운영체제 수업에서 배운 프로세스 스케줄링 알고리즘을 LLM API 요청 관리에 적용해보고, 알고리즘별 성능과 공정성을 비교하는 것이 본 프로젝트의 목적이다. 구체적으로 다음 세 가지 연구 질문에 답한다.</w:t>
+        <w:t xml:space="preserve">운영체제 수업에서 배운 프로세스 스케줄링 알고리즘을 LLM API 요청 관리에 적용하고, 알고리즘별 성능과 공정성을 비교하는 것이 본 프로젝트의 목적이다. 구체적으로 다음 세 가지 연구 질문에 답한다.</w:t>
       </w:r>
     </w:p>
     <w:p>
@@ -2681,8 +2681,56 @@
           <w:sz w:val="20"/>
           <w:szCs w:val="20"/>
         </w:rPr>
-        <w:t xml:space="preserve">사용자 요청은 다음 순서로 처리된다 (그림 3). 1) REST API(`POST /api/requests`)로 요청 도착, 2) API 계층이 요청 객체 생성, 3) </w:t>
-      </w:r>
+        <w:t xml:space="preserve">사용자 요청은 다음 순서로 처리된다 (그림 3).</w:t>
+      </w:r>
+    </w:p>
+    <w:p>
+      <w:pPr>
+        <w:pStyle w:val="ListParagraph"/>
+        <w:numPr>
+          <w:ilvl w:val="0"/>
+          <w:numId w:val="2"/>
+        </w:numPr>
+        <w:spacing w:after="80" w:line="240"/>
+      </w:pPr>
+      <w:r>
+        <w:rPr>
+          <w:rFonts w:ascii="맑은 고딕" w:cs="맑은 고딕" w:eastAsia="맑은 고딕" w:hAnsi="맑은 고딕"/>
+          <w:color w:val="000000"/>
+          <w:sz w:val="20"/>
+          <w:szCs w:val="20"/>
+        </w:rPr>
+        <w:t xml:space="preserve">REST API(`POST /api/requests`)로 요청 도착</w:t>
+      </w:r>
+    </w:p>
+    <w:p>
+      <w:pPr>
+        <w:pStyle w:val="ListParagraph"/>
+        <w:numPr>
+          <w:ilvl w:val="0"/>
+          <w:numId w:val="2"/>
+        </w:numPr>
+        <w:spacing w:after="80" w:line="240"/>
+      </w:pPr>
+      <w:r>
+        <w:rPr>
+          <w:rFonts w:ascii="맑은 고딕" w:cs="맑은 고딕" w:eastAsia="맑은 고딕" w:hAnsi="맑은 고딕"/>
+          <w:color w:val="000000"/>
+          <w:sz w:val="20"/>
+          <w:szCs w:val="20"/>
+        </w:rPr>
+        <w:t xml:space="preserve">API 계층이 요청 객체 생성</w:t>
+      </w:r>
+    </w:p>
+    <w:p>
+      <w:pPr>
+        <w:pStyle w:val="ListParagraph"/>
+        <w:numPr>
+          <w:ilvl w:val="0"/>
+          <w:numId w:val="2"/>
+        </w:numPr>
+        <w:spacing w:after="80" w:line="240"/>
+      </w:pPr>
       <w:r>
         <w:rPr>
           <w:rFonts w:ascii="맑은 고딕" w:cs="맑은 고딕" w:eastAsia="맑은 고딕" w:hAnsi="맑은 고딕"/>
@@ -2701,7 +2749,97 @@
           <w:sz w:val="20"/>
           <w:szCs w:val="20"/>
         </w:rPr>
-        <w:t xml:space="preserve">(초과 시 HTTP 429로 거부, 4.4절 참조), 4) 스케줄러 대기열에 등록(`enqueue`), 5) 스케줄러가 알고리즘에 따라 `dequeue`, 6) Ollama에 전달해 응답 수신, 7) 클라이언트 반환 및 JSON 이력 기록. 대기열이 남으면 5번부터 반복한다.</w:t>
+        <w:t xml:space="preserve"> (초과 시 HTTP 429로 거부, 4.4절 참조)</w:t>
+      </w:r>
+    </w:p>
+    <w:p>
+      <w:pPr>
+        <w:pStyle w:val="ListParagraph"/>
+        <w:numPr>
+          <w:ilvl w:val="0"/>
+          <w:numId w:val="2"/>
+        </w:numPr>
+        <w:spacing w:after="80" w:line="240"/>
+      </w:pPr>
+      <w:r>
+        <w:rPr>
+          <w:rFonts w:ascii="맑은 고딕" w:cs="맑은 고딕" w:eastAsia="맑은 고딕" w:hAnsi="맑은 고딕"/>
+          <w:color w:val="000000"/>
+          <w:sz w:val="20"/>
+          <w:szCs w:val="20"/>
+        </w:rPr>
+        <w:t xml:space="preserve">스케줄러 대기열에 등록(`enqueue`)</w:t>
+      </w:r>
+    </w:p>
+    <w:p>
+      <w:pPr>
+        <w:pStyle w:val="ListParagraph"/>
+        <w:numPr>
+          <w:ilvl w:val="0"/>
+          <w:numId w:val="2"/>
+        </w:numPr>
+        <w:spacing w:after="80" w:line="240"/>
+      </w:pPr>
+      <w:r>
+        <w:rPr>
+          <w:rFonts w:ascii="맑은 고딕" w:cs="맑은 고딕" w:eastAsia="맑은 고딕" w:hAnsi="맑은 고딕"/>
+          <w:color w:val="000000"/>
+          <w:sz w:val="20"/>
+          <w:szCs w:val="20"/>
+        </w:rPr>
+        <w:t xml:space="preserve">스케줄러가 알고리즘에 따라 `dequeue`</w:t>
+      </w:r>
+    </w:p>
+    <w:p>
+      <w:pPr>
+        <w:pStyle w:val="ListParagraph"/>
+        <w:numPr>
+          <w:ilvl w:val="0"/>
+          <w:numId w:val="2"/>
+        </w:numPr>
+        <w:spacing w:after="80" w:line="240"/>
+      </w:pPr>
+      <w:r>
+        <w:rPr>
+          <w:rFonts w:ascii="맑은 고딕" w:cs="맑은 고딕" w:eastAsia="맑은 고딕" w:hAnsi="맑은 고딕"/>
+          <w:color w:val="000000"/>
+          <w:sz w:val="20"/>
+          <w:szCs w:val="20"/>
+        </w:rPr>
+        <w:t xml:space="preserve">Ollama에 전달해 응답 수신</w:t>
+      </w:r>
+    </w:p>
+    <w:p>
+      <w:pPr>
+        <w:pStyle w:val="ListParagraph"/>
+        <w:numPr>
+          <w:ilvl w:val="0"/>
+          <w:numId w:val="2"/>
+        </w:numPr>
+        <w:spacing w:after="80" w:line="240"/>
+      </w:pPr>
+      <w:r>
+        <w:rPr>
+          <w:rFonts w:ascii="맑은 고딕" w:cs="맑은 고딕" w:eastAsia="맑은 고딕" w:hAnsi="맑은 고딕"/>
+          <w:color w:val="000000"/>
+          <w:sz w:val="20"/>
+          <w:szCs w:val="20"/>
+        </w:rPr>
+        <w:t xml:space="preserve">클라이언트 반환 및 JSON 이력 기록</w:t>
+      </w:r>
+    </w:p>
+    <w:p>
+      <w:pPr>
+        <w:spacing w:after="120" w:line="240"/>
+      </w:pPr>
+      <w:r>
+        <w:rPr>
+          <w:rFonts w:ascii="맑은 고딕" w:cs="맑은 고딕" w:eastAsia="맑은 고딕" w:hAnsi="맑은 고딕"/>
+          <w:color w:val="000000"/>
+          <w:sz w:val="20"/>
+          <w:szCs w:val="20"/>
+        </w:rPr>
+        <w:t xml:space="preserve">대기열이 남으면 5번부터 반복한다.</w:t>
       </w:r>
     </w:p>
     <w:p>
@@ -4626,7 +4764,7 @@
           <w:sz w:val="20"/>
           <w:szCs w:val="20"/>
         </w:rPr>
-        <w:t xml:space="preserve">스케줄러 4종과 Rate Limiter를 모두 구현하여 동작을 확인하였고, 스케줄러별 단위 테스트를 작성·통과시켰다. 환경변수(`SCHEDULER_TYPE`)로 알고리즘을 실시간 전환할 수 있으며, 대기열 상태와 처리 통계를 브라우저에서 확인할 수 있는 웹 대시보드(`public/dashboard.html`)를 함께 구성하여 동일 요청에 대한 알고리즘별 처리 순서를 시각적으로 비교할 수 있도록 하였다.</w:t>
+        <w:t xml:space="preserve">스케줄러 4종과 Rate Limiter를 모두 구현하여 동작을 확인하였고, 스케줄러별 단위 테스트를 작성·통과시켰다. 환경변수(`SCHEDULER_TYPE`)로 알고리즘을 즉시 전환할 수 있으며, 대기열 상태와 처리 통계를 브라우저에서 확인할 수 있는 웹 대시보드(`public/dashboard.html`)를 함께 구성하여 동일 요청에 대한 알고리즘별 처리 순서를 시각적으로 비교할 수 있도록 하였다.</w:t>
       </w:r>
     </w:p>
     <w:p>
@@ -12268,7 +12406,7 @@
           <w:sz w:val="20"/>
           <w:szCs w:val="20"/>
         </w:rPr>
-        <w:t xml:space="preserve">본 프로젝트는 두 가지 면에서 의의가 있다. 첫째, CPU 스케줄링(FCFS, Priority, MLFQ)과 네트워크 자원 배분(WFQ) 알고리즘을 LLM API 환경에 적용해 운영체제 이론의 실제 응용을 확인하였다. 둘째, vLLM·TGI 등 기존 LLM 서빙 도구가 전체 처리량 최적화에 집중하여 사용자별 공정성이나 우선순위 관리를 제공하지 않는다는 점을 확인하였다. 본 프로젝트는 이 부분에 스케줄링 이론을 적용하여 알고리즘별 효과를 비교하였다. 특히 WFQ의 가중치 비례 차등 서비스는 유료 LLM 서비스의 구독 등급 관리에 활용할 가능성을 보여준다. 다만 세 실험을 합산하여도 총 3,020건 규모이므로, 대규모 운영 환경에서도 같은 결과가 나올지는 추가 확인이 필요하다.</w:t>
+        <w:t xml:space="preserve">이 프로젝트는 두 가지 면에서 의의가 있다. 첫째, CPU 스케줄링(FCFS, Priority, MLFQ)과 네트워크 자원 배분(WFQ) 알고리즘을 LLM API 환경에 적용해 운영체제 이론의 실제 응용을 확인하였다. 둘째, vLLM·TGI 등 기존 LLM 서빙 도구가 전체 처리량 최적화에 집중하여 사용자별 공정성이나 우선순위 관리를 제공하지 않는다는 점을 확인하였다. 본 프로젝트는 이 부분에 스케줄링 이론을 적용하여 알고리즘별 효과를 비교하였다. 특히 WFQ의 가중치 비례 차등 서비스는 유료 LLM 서비스의 구독 등급 관리에 활용할 가능성을 보여준다. 다만 세 실험을 합산하여도 총 3,020건 규모이므로, 대규모 운영 환경에서도 같은 결과가 나올지는 추가 확인이 필요하다.</w:t>
       </w:r>
     </w:p>
     <w:p>

</xml_diff>